<commit_message>
Document prespecified cut-point selection and bootstrap stability
Update A7 rounded-score calibration, A10 sharing comparisons, manuscript explanations, archived sources, and rendered reports. Refresh published report links.

Co-authored-by: Copilot <223556219+Copilot@users.noreply.github.com>
</commit_message>
<xml_diff>
--- a/Reports/MS_Appendix_1_2026-10-21.docx
+++ b/Reports/MS_Appendix_1_2026-10-21.docx
@@ -80,7 +80,7 @@
       </w:pPr>
       <w:r>
         <w:rPr/>
-        <w:t>(3) 2 T-score cut points divide the T score into 3 bands that stand in for the number of impaired domains; and</w:t>
+        <w:t>(3) 2 integer cut points divide the T score, rounded to an integer, into 3 bands that stand in for the number of impaired domains; and</w:t>
       </w:r>
     </w:p>
     <w:p>
@@ -2161,7 +2161,7 @@
       </w:r>
       <w:r>
         <w:rPr/>
-        <w:t>) at T &lt; 37 and a moderate cut point (τ</w:t>
+        <w:t>) at rounded T &lt; 39 and a moderate cut point (τ</w:t>
       </w:r>
       <w:r>
         <w:rPr>
@@ -2171,7 +2171,7 @@
       </w:r>
       <w:r>
         <w:rPr/>
-        <w:t>) at T &lt; 48. The 2 cut points stand in for the count of impaired domains: T below τ</w:t>
+        <w:t>) at rounded T &lt; 48. The 2 cut points stand in for the count of impaired domains: T below τ</w:t>
       </w:r>
       <w:r>
         <w:rPr>
@@ -2211,7 +2211,17 @@
       </w:pPr>
       <w:r>
         <w:rPr/>
-        <w:t>The severe cut point lies above the T score below which the weighted share of HRS-HCAP Wave 1 participants equals the share with 2 or more impaired domains by the Manly-Jones algorithm (13%; T ≈ 35; n = 3,283). The moderate cut point lies above the T score that matches the share with 1 or more impaired domains (32%; T ≈ 43). A higher moderate cut point is needed because the core rules classify participants below τ</w:t>
+        <w:t>We selected the 2 cut points with the following procedure: The T score was rounded to the nearest integer, and both cut points are integers; integer cut points are simple to apply and report, and a fractional cut point would imply a precision the T score does not have. We evaluated every integer pair of cut points (τ</w:t>
+      </w:r>
+      <w:r>
+        <w:rPr>
+          <w:vertAlign w:val="subscript"/>
+        </w:rPr>
+        <w:t>1</w:t>
+      </w:r>
+      <w:r>
+        <w:rPr/>
+        <w:t xml:space="preserve"> from 25 to 50, τ</w:t>
       </w:r>
       <w:r>
         <w:rPr>
@@ -2221,7 +2231,27 @@
       </w:r>
       <w:r>
         <w:rPr/>
-        <w:t xml:space="preserve"> who do not report memory worsening as normal (Step 4), which lowers the MCI classification rate of the core algorithm relative to the HRS-HCAP algorithm.</w:t>
+        <w:t xml:space="preserve"> from 30 to 60, τ</w:t>
+      </w:r>
+      <w:r>
+        <w:rPr>
+          <w:vertAlign w:val="subscript"/>
+        </w:rPr>
+        <w:t>2</w:t>
+      </w:r>
+      <w:r>
+        <w:rPr/>
+        <w:t xml:space="preserve"> above τ</w:t>
+      </w:r>
+      <w:r>
+        <w:rPr>
+          <w:vertAlign w:val="subscript"/>
+        </w:rPr>
+        <w:t>1</w:t>
+      </w:r>
+      <w:r>
+        <w:rPr/>
+        <w:t>) in HRS-HCAP Wave 1, with the classification rules of Step 4 held fixed. A threshold pair was a candidate for selection if the weighted dementia prevalence of the core algorithm was within 0.5 percentage points of the Manly-Jones dementia prevalence and its weighted MCI prevalence was within 1.0 points of the Manly-Jones MCI prevalence. Among eligible pairs, we chose the pair with the highest weighted kappa for dementia versus no dementia, and broke ties with the weighted 3-class kappa (quadratic weights). If no pair had been identified as a candidate, the rule widened the dementia tolerance to 1.0 point (and no further) and then widened the MCI tolerance in steps of 0.5 points. The rule puts prevalence first because the core algorithm is used to estimate prevalence and incidence in waves without an HCAP assessment, and puts dementia agreement second because several pairs can match prevalence equally well.</w:t>
       </w:r>
       <w:bookmarkEnd w:id="5"/>
     </w:p>
@@ -2243,6 +2273,66 @@
       </w:pPr>
       <w:r>
         <w:rPr/>
+        <w:t>In HRS-HCAP Wave 1 (n = 3,496), 5 of 575 pairs of thresholds were identified as candidates. The rule selected τ</w:t>
+      </w:r>
+      <w:r>
+        <w:rPr>
+          <w:vertAlign w:val="subscript"/>
+        </w:rPr>
+        <w:t>1</w:t>
+      </w:r>
+      <w:r>
+        <w:rPr/>
+        <w:t xml:space="preserve"> = 39 and τ</w:t>
+      </w:r>
+      <w:r>
+        <w:rPr>
+          <w:vertAlign w:val="subscript"/>
+        </w:rPr>
+        <w:t>2</w:t>
+      </w:r>
+      <w:r>
+        <w:rPr/>
+        <w:t xml:space="preserve"> = 48, so a rounded T score below 39 marks the severe range and a rounded T score from 39 to 47 marks the moderate range of the T score. At these cut points the weighted dementia kappa was 0.34 and the 3-class kappa was 0.50; Table A3 gives the class prevalence estimates. To describe how firm the selection is, we repeated the whole rule in 500 bootstrap samples drawn by the HRS sampling design; the rule selected the same pair in 8% of the bootstrap samples and a pair within 1 point of both cut points in 50% of the bootstrap samples.</w:t>
+      </w:r>
+    </w:p>
+    <w:p>
+      <w:pPr>
+        <w:pStyle w:val="BodyText"/>
+        <w:rPr/>
+      </w:pPr>
+      <w:r>
+        <w:rPr/>
+        <w:t>The same pair recurs in few bootstrap samples because the rule compares prevalence in whole T-score steps against limits of 0.5 and 1.0 percentage points. Next to the selected cut points, a 1-point change in τ</w:t>
+      </w:r>
+      <w:r>
+        <w:rPr>
+          <w:vertAlign w:val="subscript"/>
+        </w:rPr>
+        <w:t>1</w:t>
+      </w:r>
+      <w:r>
+        <w:rPr/>
+        <w:t xml:space="preserve"> changed the weighted dementia prevalence by 0.5 percentage points, and a 1-point change in τ</w:t>
+      </w:r>
+      <w:r>
+        <w:rPr>
+          <w:vertAlign w:val="subscript"/>
+        </w:rPr>
+        <w:t>2</w:t>
+      </w:r>
+      <w:r>
+        <w:rPr/>
+        <w:t xml:space="preserve"> changed the weighted MCI prevalence by 0.9 points. In a new sample, the prevalence from both algorithms shifts by a fraction of a point, and that shift can move a pair into or out of the candidate set. The rule fixes one pair, but the data do not separate it from its neighbors: pairs within 1 point of both cut points were selected in 50% of the bootstrap samples.</w:t>
+      </w:r>
+    </w:p>
+    <w:p>
+      <w:pPr>
+        <w:pStyle w:val="BodyText"/>
+        <w:rPr/>
+      </w:pPr>
+      <w:r>
+        <w:rPr/>
         <w:t>Figure A2 shows the weighted distribution of T scores among HRS-HCAP Wave 1 participants with core cognitive tests, with the 2 cut points and the weighted share of participants in each T-score band.</w:t>
       </w:r>
     </w:p>
@@ -2257,7 +2347,7 @@
           <wp:inline distT="0" distB="0" distL="0" distR="0">
             <wp:extent cx="5930900" cy="3284855"/>
             <wp:effectExtent l="0" t="0" r="0" b="0"/>
-            <wp:docPr id="2" name="Image2" descr="Figure A2. Weighted distribution of demographically adjusted T scores among HRS-HCAP Wave 1 participants with core cognitive tests (n = 3,283), with the cut points (dashed lines). Band labels give the weighted share of these participants in each T-score band."/>
+            <wp:docPr id="2" name="Image2" descr="Figure A2. Weighted distribution of demographically adjusted T scores among HRS-HCAP Wave 1 participants with core cognitive tests (n = 3,283), with the cut points (dashed lines). Cut points apply to the T score rounded to an integer, so each dashed line sits 0.5 below its cut point. Band labels give the weighted share of these participants in each band of the rounded T score."/>
             <wp:cNvGraphicFramePr>
               <a:graphicFrameLocks xmlns:a="http://schemas.openxmlformats.org/drawingml/2006/main" noChangeAspect="1"/>
             </wp:cNvGraphicFramePr>
@@ -2265,7 +2355,7 @@
               <a:graphicData uri="http://schemas.openxmlformats.org/drawingml/2006/picture">
                 <pic:pic xmlns:pic="http://schemas.openxmlformats.org/drawingml/2006/picture">
                   <pic:nvPicPr>
-                    <pic:cNvPr id="2" name="Image2" descr="Figure A2. Weighted distribution of demographically adjusted T scores among HRS-HCAP Wave 1 participants with core cognitive tests (n = 3,283), with the cut points (dashed lines). Band labels give the weighted share of these participants in each T-score band."/>
+                    <pic:cNvPr id="2" name="Image2" descr="Figure A2. Weighted distribution of demographically adjusted T scores among HRS-HCAP Wave 1 participants with core cognitive tests (n = 3,283), with the cut points (dashed lines). Cut points apply to the T score rounded to an integer, so each dashed line sits 0.5 below its cut point. Band labels give the weighted share of these participants in each band of the rounded T score."/>
                     <pic:cNvPicPr>
                       <a:picLocks noChangeAspect="1" noChangeArrowheads="1"/>
                     </pic:cNvPicPr>
@@ -2300,7 +2390,7 @@
       </w:pPr>
       <w:r>
         <w:rPr/>
-        <w:t>Figure A2. Weighted distribution of demographically adjusted T scores among HRS-HCAP Wave 1 participants with core cognitive tests (n = 3,283), with the cut points (dashed lines). Band labels give the weighted share of these participants in each T-score band.</w:t>
+        <w:t>Figure A2. Weighted distribution of demographically adjusted T scores among HRS-HCAP Wave 1 participants with core cognitive tests (n = 3,283), with the cut points (dashed lines). Cut points apply to the T score rounded to an integer, so each dashed line sits 0.5 below its cut point. Band labels give the weighted share of these participants in each band of the rounded T score.</w:t>
       </w:r>
       <w:bookmarkEnd w:id="6"/>
     </w:p>
@@ -2732,7 +2822,7 @@
                 <w:szCs w:val="16"/>
                 <w:u w:val="none"/>
               </w:rPr>
-              <w:t>T &lt; 37</w:t>
+              <w:t>T &lt; 39</w:t>
             </w:r>
           </w:p>
         </w:tc>
@@ -2864,7 +2954,7 @@
                 <w:szCs w:val="16"/>
                 <w:u w:val="none"/>
               </w:rPr>
-              <w:t>209</w:t>
+              <w:t>237</w:t>
             </w:r>
           </w:p>
         </w:tc>
@@ -2953,7 +3043,7 @@
                 <w:szCs w:val="16"/>
                 <w:u w:val="none"/>
               </w:rPr>
-              <w:t>T &lt; 37</w:t>
+              <w:t>T &lt; 39</w:t>
             </w:r>
           </w:p>
         </w:tc>
@@ -3079,7 +3169,7 @@
                 <w:szCs w:val="16"/>
                 <w:u w:val="none"/>
               </w:rPr>
-              <w:t>390</w:t>
+              <w:t>487</w:t>
             </w:r>
           </w:p>
         </w:tc>
@@ -3168,7 +3258,7 @@
                 <w:szCs w:val="16"/>
                 <w:u w:val="none"/>
               </w:rPr>
-              <w:t>37 ≤ T &lt; 48</w:t>
+              <w:t>39 ≤ T &lt; 48</w:t>
             </w:r>
           </w:p>
         </w:tc>
@@ -3294,7 +3384,7 @@
                 <w:szCs w:val="16"/>
                 <w:u w:val="none"/>
               </w:rPr>
-              <w:t>320</w:t>
+              <w:t>270</w:t>
             </w:r>
           </w:p>
         </w:tc>
@@ -3383,7 +3473,7 @@
                 <w:szCs w:val="16"/>
                 <w:u w:val="none"/>
               </w:rPr>
-              <w:t>37 ≤ T &lt; 48</w:t>
+              <w:t>39 ≤ T &lt; 48</w:t>
             </w:r>
           </w:p>
         </w:tc>
@@ -3509,7 +3599,7 @@
                 <w:szCs w:val="16"/>
                 <w:u w:val="none"/>
               </w:rPr>
-              <w:t>816</w:t>
+              <w:t>674</w:t>
             </w:r>
           </w:p>
         </w:tc>
@@ -3724,7 +3814,7 @@
                 <w:szCs w:val="16"/>
                 <w:u w:val="none"/>
               </w:rPr>
-              <w:t>1,548</w:t>
+              <w:t>1,615</w:t>
             </w:r>
           </w:p>
         </w:tc>
@@ -4429,7 +4519,7 @@
                 <w:szCs w:val="16"/>
                 <w:u w:val="none"/>
               </w:rPr>
-              <w:t>n: unweighted HRS-HCAP Wave 1 participants (N = 3,496; Normal 2,433, MCI 747, Dementia 316). T: demographically adjusted T score (mean 50, SD 10 in the HRS-HCAP robust normative sample). *Self-rated memory compared with 2 years ago (HRS item D102); don't know, refused, and not ascertained count as worse; missing values were singly imputed. IQCODE: 16-item Informant Questionnaire on Cognitive Decline in the Elderly, mean item score (1-5), asked in proxy interviews.</w:t>
+              <w:t>n: unweighted HRS-HCAP Wave 1 participants (N = 3,496; Normal 2,358, MCI 794, Dementia 344). T: demographically adjusted T score (mean 50, SD 10 in the HRS-HCAP robust normative sample). *Self-rated memory compared with 2 years ago (HRS item D102); don't know, refused, and not ascertained count as worse; missing values were singly imputed. IQCODE: 16-item Informant Questionnaire on Cognitive Decline in the Elderly, mean item score (1-5), asked in proxy interviews.</w:t>
             </w:r>
           </w:p>
         </w:tc>
@@ -4442,7 +4532,7 @@
       </w:pPr>
       <w:r>
         <w:rPr/>
-        <w:t>With these rules, the weighted prevalence estimates of the core algorithm in HRS-HCAP Wave 1 were 71.0% normal, 20.7% MCI, and 8.3% dementia, compared with 69.4%, 21.4%, and 9.2% for the Manly-Jones algorithm estimated with EAP factor scores (Table A3).</w:t>
+        <w:t>With these rules, the weighted prevalence estimates of the core algorithm in HRS-HCAP Wave 1 were 68.9% normal, 22.0% MCI, and 9.1% dementia, compared with 69.4%, 21.4%, and 9.2% for the Manly-Jones algorithm estimated with EAP factor scores (Table A3).</w:t>
       </w:r>
     </w:p>
     <w:tbl>
@@ -4796,7 +4886,7 @@
                 <w:szCs w:val="16"/>
                 <w:u w:val="none"/>
               </w:rPr>
-              <w:t>71.0</w:t>
+              <w:t>68.9</w:t>
             </w:r>
           </w:p>
         </w:tc>
@@ -4840,7 +4930,7 @@
                 <w:szCs w:val="16"/>
                 <w:u w:val="none"/>
               </w:rPr>
-              <w:t>20.7</w:t>
+              <w:t>22.0</w:t>
             </w:r>
           </w:p>
         </w:tc>
@@ -4884,7 +4974,7 @@
                 <w:szCs w:val="16"/>
                 <w:u w:val="none"/>
               </w:rPr>
-              <w:t>8.3</w:t>
+              <w:t>9.1</w:t>
             </w:r>
           </w:p>
         </w:tc>
@@ -5115,7 +5205,7 @@
                 <w:szCs w:val="16"/>
                 <w:u w:val="none"/>
               </w:rPr>
-              <w:t>HRS-HCAP Wave 1, N = 3,496. Percentages are weighted (HCAP Wave 1 (2016) sampling weight). Core algorithm cut points: T &lt; 37 (severe) and T &lt; 48 (moderate).</w:t>
+              <w:t>HRS-HCAP Wave 1, N = 3,496. Percentages are weighted (HCAP Wave 1 (2016) sampling weight). Core algorithm cut points: rounded T &lt; 39 (severe) and rounded T &lt; 48 (moderate).</w:t>
             </w:r>
             <w:bookmarkStart w:id="7" w:name="step-4.-classification-rules"/>
             <w:bookmarkEnd w:id="7"/>
@@ -5150,7 +5240,7 @@
       </w:pPr>
       <w:r>
         <w:rPr/>
-        <w:t>Agreement of the core algorithm with the Manly-Jones algorithm for 3-class Normal/MCI/Dementia classification was about the same as the agreement of Langa-Weir; for dementia versus not, it was lower than that of Langa-Weir (Table A4). The quadratic weighted kappa (Cohen, 1968) for the 3 classes was 0.50 for the core algorithm and 0.51 for Langa-Weir; for dementia versus not, kappa was 0.35 and 0.41. Of the weighted population the Manly-Jones algorithm classified as having dementia, the core algorithm classified 39% as having dementia and Langa-Weir classified 42%. Of those the core algorithm classified as having dementia, 43% had dementia by the Manly-Jones algorithm (Langa-Weir: 50%). Agreement between the core algorithm and Langa-Weir was 0.56 (3 classes, weighted kappa) and 0.44 (dementia, kappa). Table A5 gives the weighted cross-classifications. Each kappa compares 2 classifications that both contain error, so these values describe agreement and not accuracy.</w:t>
+        <w:t>Agreement of the core algorithm with the Manly-Jones algorithm for 3-class Normal/MCI/Dementia classification was about the same as the agreement of Langa-Weir; for dementia versus not, it was lower than that of Langa-Weir (Table A4). The quadratic weighted kappa (Cohen, 1968) for the 3 classes was 0.50 for the core algorithm and 0.51 for Langa-Weir; for dementia versus not, kappa was 0.34 and 0.41. Of the weighted population the Manly-Jones algorithm classified as having dementia, the core algorithm classified 40% as having dementia and Langa-Weir classified 42%. Of those the core algorithm classified as having dementia, 40% had dementia by the Manly-Jones algorithm (Langa-Weir: 50%). Agreement between the core algorithm and Langa-Weir was 0.56 (3 classes, weighted kappa) and 0.41 (dementia, kappa). Table A5 gives the weighted cross-classifications. Each kappa compares 2 classifications that both contain error, so these values describe agreement and not accuracy.</w:t>
       </w:r>
     </w:p>
     <w:tbl>
@@ -5595,7 +5685,7 @@
                 <w:szCs w:val="16"/>
                 <w:u w:val="none"/>
               </w:rPr>
-              <w:t>0.35</w:t>
+              <w:t>0.34</w:t>
             </w:r>
           </w:p>
         </w:tc>
@@ -5639,7 +5729,7 @@
                 <w:szCs w:val="16"/>
                 <w:u w:val="none"/>
               </w:rPr>
-              <w:t>39</w:t>
+              <w:t>40</w:t>
             </w:r>
           </w:p>
         </w:tc>
@@ -5683,7 +5773,7 @@
                 <w:szCs w:val="16"/>
                 <w:u w:val="none"/>
               </w:rPr>
-              <w:t>43</w:t>
+              <w:t>40</w:t>
             </w:r>
           </w:p>
         </w:tc>
@@ -6035,7 +6125,7 @@
                 <w:szCs w:val="16"/>
                 <w:u w:val="none"/>
               </w:rPr>
-              <w:t>0.44</w:t>
+              <w:t>0.41</w:t>
             </w:r>
           </w:p>
         </w:tc>
@@ -6677,7 +6767,7 @@
                 <w:szCs w:val="16"/>
                 <w:u w:val="none"/>
               </w:rPr>
-              <w:t>29,237 (84%)</w:t>
+              <w:t>28,638 (82%)</w:t>
             </w:r>
           </w:p>
         </w:tc>
@@ -6721,7 +6811,7 @@
                 <w:szCs w:val="16"/>
                 <w:u w:val="none"/>
               </w:rPr>
-              <w:t>4,750 (14%)</w:t>
+              <w:t>5,145 (15%)</w:t>
             </w:r>
           </w:p>
         </w:tc>
@@ -6765,7 +6855,7 @@
                 <w:szCs w:val="16"/>
                 <w:u w:val="none"/>
               </w:rPr>
-              <w:t>802 (2%)</w:t>
+              <w:t>1,005 (3%)</w:t>
             </w:r>
           </w:p>
         </w:tc>
@@ -6940,7 +7030,7 @@
                 <w:szCs w:val="16"/>
                 <w:u w:val="none"/>
               </w:rPr>
-              <w:t>5,462 (51%)</w:t>
+              <w:t>5,098 (48%)</w:t>
             </w:r>
           </w:p>
         </w:tc>
@@ -6982,7 +7072,7 @@
                 <w:szCs w:val="16"/>
                 <w:u w:val="none"/>
               </w:rPr>
-              <w:t>3,712 (35%)</w:t>
+              <w:t>3,876 (36%)</w:t>
             </w:r>
           </w:p>
         </w:tc>
@@ -7024,7 +7114,7 @@
                 <w:szCs w:val="16"/>
                 <w:u w:val="none"/>
               </w:rPr>
-              <w:t>1,551 (14%)</w:t>
+              <w:t>1,751 (16%)</w:t>
             </w:r>
           </w:p>
         </w:tc>
@@ -7197,7 +7287,7 @@
                 <w:szCs w:val="16"/>
                 <w:u w:val="none"/>
               </w:rPr>
-              <w:t>890 (19%)</w:t>
+              <w:t>794 (17%)</w:t>
             </w:r>
           </w:p>
         </w:tc>
@@ -7239,7 +7329,7 @@
                 <w:szCs w:val="16"/>
                 <w:u w:val="none"/>
               </w:rPr>
-              <w:t>1,933 (42%)</w:t>
+              <w:t>1,995 (43%)</w:t>
             </w:r>
           </w:p>
         </w:tc>
@@ -7281,7 +7371,7 @@
                 <w:szCs w:val="16"/>
                 <w:u w:val="none"/>
               </w:rPr>
-              <w:t>1,797 (39%)</w:t>
+              <w:t>1,831 (40%)</w:t>
             </w:r>
           </w:p>
         </w:tc>
@@ -8897,7 +8987,7 @@
                 <w:szCs w:val="16"/>
                 <w:u w:val="none"/>
               </w:rPr>
-              <w:t>2,433 (69.6%)</w:t>
+              <w:t>2,358 (67.4%)</w:t>
             </w:r>
           </w:p>
         </w:tc>
@@ -8941,7 +9031,7 @@
                 <w:szCs w:val="16"/>
                 <w:u w:val="none"/>
               </w:rPr>
-              <w:t>747 (21.4%)</w:t>
+              <w:t>794 (22.7%)</w:t>
             </w:r>
           </w:p>
         </w:tc>
@@ -8985,7 +9075,7 @@
                 <w:szCs w:val="16"/>
                 <w:u w:val="none"/>
               </w:rPr>
-              <w:t>316 (9.0%)</w:t>
+              <w:t>344 (9.8%)</w:t>
             </w:r>
           </w:p>
         </w:tc>
@@ -9242,7 +9332,7 @@
                 <w:szCs w:val="16"/>
                 <w:u w:val="none"/>
               </w:rPr>
-              <w:t>2,163 (72.4%)</w:t>
+              <w:t>2,110 (70.6%)</w:t>
             </w:r>
           </w:p>
         </w:tc>
@@ -9284,7 +9374,7 @@
                 <w:szCs w:val="16"/>
                 <w:u w:val="none"/>
               </w:rPr>
-              <w:t>603 (20.2%)</w:t>
+              <w:t>631 (21.1%)</w:t>
             </w:r>
           </w:p>
         </w:tc>
@@ -9326,7 +9416,7 @@
                 <w:szCs w:val="16"/>
                 <w:u w:val="none"/>
               </w:rPr>
-              <w:t>222 (7.4%)</w:t>
+              <w:t>247 (8.3%)</w:t>
             </w:r>
           </w:p>
         </w:tc>
@@ -9583,7 +9673,7 @@
                 <w:szCs w:val="16"/>
                 <w:u w:val="none"/>
               </w:rPr>
-              <w:t>1,920 (75.1%)</w:t>
+              <w:t>1,879 (73.5%)</w:t>
             </w:r>
           </w:p>
         </w:tc>
@@ -9625,7 +9715,7 @@
                 <w:szCs w:val="16"/>
                 <w:u w:val="none"/>
               </w:rPr>
-              <w:t>450 (17.6%)</w:t>
+              <w:t>478 (18.7%)</w:t>
             </w:r>
           </w:p>
         </w:tc>
@@ -9667,7 +9757,7 @@
                 <w:szCs w:val="16"/>
                 <w:u w:val="none"/>
               </w:rPr>
-              <w:t>188 (7.3%)</w:t>
+              <w:t>201 (7.9%)</w:t>
             </w:r>
           </w:p>
         </w:tc>
@@ -9936,7 +10026,7 @@
                 <w:szCs w:val="16"/>
                 <w:u w:val="none"/>
               </w:rPr>
-              <w:t>1,474 (71.9%)</w:t>
+              <w:t>1,449 (70.7%)</w:t>
             </w:r>
           </w:p>
         </w:tc>
@@ -9980,7 +10070,7 @@
                 <w:szCs w:val="16"/>
                 <w:u w:val="none"/>
               </w:rPr>
-              <w:t>392 (19.1%)</w:t>
+              <w:t>399 (19.5%)</w:t>
             </w:r>
           </w:p>
         </w:tc>
@@ -10024,7 +10114,7 @@
                 <w:szCs w:val="16"/>
                 <w:u w:val="none"/>
               </w:rPr>
-              <w:t>183 (8.9%)</w:t>
+              <w:t>201 (9.8%)</w:t>
             </w:r>
           </w:p>
         </w:tc>
@@ -14231,7 +14321,7 @@
       </w:pPr>
       <w:r>
         <w:rPr/>
-        <w:t>First, the cut points may have been chosen with reference to the HRS-HCAP Wave 1 sample, in which agreement is also evaluated, so the agreement in Table A4 may be optimistic. The comparison of core-based and HRS-HCAP-based classifications among Wave 2 re-interviewees (eTables 7 and 8) is the out-of-sample check available in these data.</w:t>
+        <w:t>First, the cut points were selected in the HRS-HCAP Wave 1 sample, in which agreement is also evaluated, so the agreement in Table A4 is optimistic. The comparison of core-based and HRS-HCAP-based classifications among Wave 2 re-interviewees (eTables 7 and 8) is the out-of-sample check available in these data.</w:t>
       </w:r>
     </w:p>
     <w:p>
@@ -14312,7 +14402,7 @@
       </w:pPr>
       <w:r>
         <w:rPr/>
-        <w:t>First, few participants report any limitation, even among those the Manly-Jones algorithm classifies as having dementia. Among HRS-HCAP Wave 1 participants with a core T score, the weighted share reporting no ADL or IADL limitation was 52.3% for those with dementia by the Manly-Jones algorithm, 68.7% for MCI, and 84.0% for normal cognition; below the severe T cut point, 64.0% reported none (Table A9). By definition, every participant the Manly-Jones algorithm classifies as having dementia has an informant report of functional impairment, yet 52.3% of them report no limitation in the core interview. The lowest possible threshold, 1 or more limitations, misses at least that share, and no threshold on the limitation count can do better.</w:t>
+        <w:t>Few participants report any limitation, even among those the Manly-Jones algorithm classifies as having dementia. Among HRS-HCAP Wave 1 participants with a core T score, the weighted share reporting no ADL or IADL limitation was 52.3% for those with dementia by the Manly-Jones algorithm, 68.7% for MCI, and 84.0% for normal cognition; below the severe T cut point, 66.1% reported none (Table A9). By definition, every participant the Manly-Jones algorithm classifies as having dementia has an informant report of functional impairment, yet 52.3% of them report no limitation in the core interview. The lowest possible threshold, 1 or more limitations, misses at least that share, and no threshold on the limitation count can do better.</w:t>
       </w:r>
     </w:p>
     <w:p>
@@ -14322,7 +14412,7 @@
       </w:pPr>
       <w:r>
         <w:rPr/>
-        <w:t>Second, including function raised agreement by a small amount, and never enough to justify the apparent difference in measured construct. We examined 2 alternative rules, all at the core algorithm’s cut points (T &lt; 37 and T &lt; 48), so that the rules differ only in the second criterion: function at the severe level and function or memory at the moderate level, the closest analog of the Manly-Jones rules; and function or memory at both levels (Table A10). In the full sample, the 3-class kappa was 0.50 with the memory rule, 0.53 with the function rule, and 0.53 with function or memory; the dementia kappa was 0.35, 0.40, and 0.41. Because the cut points are held fixed, the rules also produce different class prevalence (Table A10). To describe how much these differences vary across samples, we computed agreement in each of 200 random halves of the sample (Table A11). Relative to the memory rule, the mean difference in 3-class kappa across halves was +0.03 (0.00 to +0.05) for the function rule and +0.02 (+0.01 to +0.04) for function or memory (2.5th to 97.5th percentile across halves), and the function rule had the higher kappa in 99% of halves. For dementia, the mean differences were +0.05 (-0.01 to +0.11) and +0.05 (+0.02 to +0.10). The gain is therefore small but consistent across halves, and our decision rests on the third reason.</w:t>
+        <w:t>Including function raised agreement by a small amount, and never enough to justify the apparent difference in measured construct. We examined 2 alternative rules, all at the core algorithm’s cut points (T &lt; 39 and T &lt; 48), so that the rules differ only in the second criterion: function at the severe level and function or memory at the moderate level, the closest analog of the Manly-Jones rules; and function or memory at both levels (Table A10). In the full sample, the 3-class kappa was 0.50 with the memory rule, 0.53 with the function rule, and 0.52 with function or memory; the dementia kappa was 0.34, 0.39, and 0.38. Because the cut points are held fixed, the rules also produce different class prevalence (Table A10). To describe how much these differences vary across samples, we computed agreement in each of 200 random halves of the sample (Table A11). Relative to the memory rule, the mean difference in 3-class kappa across halves was +0.02 (+0.01 to +0.04) for the function rule and +0.02 (0.00 to +0.03) for function or memory (2.5th to 97.5th percentile across halves), and the function rule had the higher kappa in 98% of halves. For dementia, the mean differences were +0.05 (0.00 to +0.11) and +0.05 (+0.01 to +0.08). The gain is therefore small but consistent across halves, and our decision rests on the third reason.</w:t>
       </w:r>
     </w:p>
     <w:p>
@@ -14332,7 +14422,7 @@
       </w:pPr>
       <w:r>
         <w:rPr/>
-        <w:t>Third, the core items do not say why a limitation is present and do not specifically ask about change the way the IQCODE and Blessed Part I measures do in HRS-HCAP, and they rely on self-report in the core, whereas in HRS-HCAP a knowledgeable informant provides the assessment of change (unspecified time frame in the Blessed, a 10-year lookback in the IQCODE).</w:t>
+        <w:t>The core items do not say why a limitation is present and do not specifically ask about change the way the IQCODE and Blessed Part I measures do in HRS-HCAP, and they rely on self-report in the core, whereas in HRS-HCAP a knowledgeable informant provides the assessment of change (unspecified time frame in the Blessed, a 10-year lookback in the IQCODE).</w:t>
       </w:r>
     </w:p>
     <w:tbl>
@@ -15734,7 +15824,7 @@
                 <w:szCs w:val="16"/>
                 <w:u w:val="none"/>
               </w:rPr>
-              <w:t>T &lt; 37</w:t>
+              <w:t>T &lt; 39</w:t>
             </w:r>
           </w:p>
         </w:tc>
@@ -15776,7 +15866,7 @@
                 <w:szCs w:val="16"/>
                 <w:u w:val="none"/>
               </w:rPr>
-              <w:t>599</w:t>
+              <w:t>724</w:t>
             </w:r>
           </w:p>
         </w:tc>
@@ -15818,7 +15908,7 @@
                 <w:szCs w:val="16"/>
                 <w:u w:val="none"/>
               </w:rPr>
-              <w:t>64.0</w:t>
+              <w:t>66.1</w:t>
             </w:r>
           </w:p>
         </w:tc>
@@ -15860,7 +15950,7 @@
                 <w:szCs w:val="16"/>
                 <w:u w:val="none"/>
               </w:rPr>
-              <w:t>12.1</w:t>
+              <w:t>12.5</w:t>
             </w:r>
           </w:p>
         </w:tc>
@@ -15902,7 +15992,7 @@
                 <w:szCs w:val="16"/>
                 <w:u w:val="none"/>
               </w:rPr>
-              <w:t>23.9</w:t>
+              <w:t>21.4</w:t>
             </w:r>
           </w:p>
         </w:tc>
@@ -16033,7 +16123,7 @@
                 <w:szCs w:val="16"/>
                 <w:u w:val="none"/>
               </w:rPr>
-              <w:t>37 to &lt; 48</w:t>
+              <w:t>39 to &lt; 48</w:t>
             </w:r>
           </w:p>
         </w:tc>
@@ -16075,7 +16165,7 @@
                 <w:szCs w:val="16"/>
                 <w:u w:val="none"/>
               </w:rPr>
-              <w:t>1,136</w:t>
+              <w:t>944</w:t>
             </w:r>
           </w:p>
         </w:tc>
@@ -16117,7 +16207,7 @@
                 <w:szCs w:val="16"/>
                 <w:u w:val="none"/>
               </w:rPr>
-              <w:t>78.3</w:t>
+              <w:t>78.8</w:t>
             </w:r>
           </w:p>
         </w:tc>
@@ -16159,7 +16249,7 @@
                 <w:szCs w:val="16"/>
                 <w:u w:val="none"/>
               </w:rPr>
-              <w:t>9.8</w:t>
+              <w:t>9.2</w:t>
             </w:r>
           </w:p>
         </w:tc>
@@ -16201,7 +16291,7 @@
                 <w:szCs w:val="16"/>
                 <w:u w:val="none"/>
               </w:rPr>
-              <w:t>11.9</w:t>
+              <w:t>12.1</w:t>
             </w:r>
           </w:p>
         </w:tc>
@@ -16380,7 +16470,7 @@
                 <w:szCs w:val="16"/>
                 <w:u w:val="none"/>
               </w:rPr>
-              <w:t>1,548</w:t>
+              <w:t>1,615</w:t>
             </w:r>
           </w:p>
         </w:tc>
@@ -16424,7 +16514,7 @@
                 <w:szCs w:val="16"/>
                 <w:u w:val="none"/>
               </w:rPr>
-              <w:t>83.7</w:t>
+              <w:t>83.5</w:t>
             </w:r>
           </w:p>
         </w:tc>
@@ -16468,7 +16558,7 @@
                 <w:szCs w:val="16"/>
                 <w:u w:val="none"/>
               </w:rPr>
-              <w:t>10.0</w:t>
+              <w:t>10.1</w:t>
             </w:r>
           </w:p>
         </w:tc>
@@ -16512,7 +16602,7 @@
                 <w:szCs w:val="16"/>
                 <w:u w:val="none"/>
               </w:rPr>
-              <w:t>6.2</w:t>
+              <w:t>6.4</w:t>
             </w:r>
           </w:p>
         </w:tc>
@@ -17160,7 +17250,7 @@
                 <w:szCs w:val="16"/>
                 <w:u w:val="none"/>
               </w:rPr>
-              <w:t>37</w:t>
+              <w:t>39</w:t>
             </w:r>
           </w:p>
         </w:tc>
@@ -17248,7 +17338,7 @@
                 <w:szCs w:val="16"/>
                 <w:u w:val="none"/>
               </w:rPr>
-              <w:t>20.7</w:t>
+              <w:t>22.0</w:t>
             </w:r>
           </w:p>
         </w:tc>
@@ -17292,7 +17382,7 @@
                 <w:szCs w:val="16"/>
                 <w:u w:val="none"/>
               </w:rPr>
-              <w:t>8.3</w:t>
+              <w:t>9.1</w:t>
             </w:r>
           </w:p>
         </w:tc>
@@ -17380,7 +17470,7 @@
                 <w:szCs w:val="16"/>
                 <w:u w:val="none"/>
               </w:rPr>
-              <w:t>0.35</w:t>
+              <w:t>0.34</w:t>
             </w:r>
           </w:p>
         </w:tc>
@@ -17424,7 +17514,7 @@
                 <w:szCs w:val="16"/>
                 <w:u w:val="none"/>
               </w:rPr>
-              <w:t>39</w:t>
+              <w:t>40</w:t>
             </w:r>
           </w:p>
         </w:tc>
@@ -17513,7 +17603,7 @@
                 <w:szCs w:val="16"/>
                 <w:u w:val="none"/>
               </w:rPr>
-              <w:t>37</w:t>
+              <w:t>39</w:t>
             </w:r>
           </w:p>
         </w:tc>
@@ -17597,7 +17687,7 @@
                 <w:szCs w:val="16"/>
                 <w:u w:val="none"/>
               </w:rPr>
-              <w:t>24.4</w:t>
+              <w:t>24.7</w:t>
             </w:r>
           </w:p>
         </w:tc>
@@ -17639,7 +17729,7 @@
                 <w:szCs w:val="16"/>
                 <w:u w:val="none"/>
               </w:rPr>
-              <w:t>8.8</w:t>
+              <w:t>9.7</w:t>
             </w:r>
           </w:p>
         </w:tc>
@@ -17723,7 +17813,7 @@
                 <w:szCs w:val="16"/>
                 <w:u w:val="none"/>
               </w:rPr>
-              <w:t>0.40</w:t>
+              <w:t>0.39</w:t>
             </w:r>
           </w:p>
         </w:tc>
@@ -17765,7 +17855,7 @@
                 <w:szCs w:val="16"/>
                 <w:u w:val="none"/>
               </w:rPr>
-              <w:t>44</w:t>
+              <w:t>46</w:t>
             </w:r>
           </w:p>
         </w:tc>
@@ -17858,7 +17948,7 @@
                 <w:szCs w:val="16"/>
                 <w:u w:val="none"/>
               </w:rPr>
-              <w:t>37</w:t>
+              <w:t>39</w:t>
             </w:r>
           </w:p>
         </w:tc>
@@ -17946,7 +18036,7 @@
                 <w:szCs w:val="16"/>
                 <w:u w:val="none"/>
               </w:rPr>
-              <w:t>21.6</w:t>
+              <w:t>21.3</w:t>
             </w:r>
           </w:p>
         </w:tc>
@@ -17990,7 +18080,7 @@
                 <w:szCs w:val="16"/>
                 <w:u w:val="none"/>
               </w:rPr>
-              <w:t>11.5</w:t>
+              <w:t>13.0</w:t>
             </w:r>
           </w:p>
         </w:tc>
@@ -18034,7 +18124,7 @@
                 <w:szCs w:val="16"/>
                 <w:u w:val="none"/>
               </w:rPr>
-              <w:t>0.53</w:t>
+              <w:t>0.52</w:t>
             </w:r>
           </w:p>
         </w:tc>
@@ -18078,7 +18168,7 @@
                 <w:szCs w:val="16"/>
                 <w:u w:val="none"/>
               </w:rPr>
-              <w:t>0.41</w:t>
+              <w:t>0.38</w:t>
             </w:r>
           </w:p>
         </w:tc>
@@ -18122,7 +18212,7 @@
                 <w:szCs w:val="16"/>
                 <w:u w:val="none"/>
               </w:rPr>
-              <w:t>53</w:t>
+              <w:t>54</w:t>
             </w:r>
           </w:p>
         </w:tc>
@@ -18172,7 +18262,7 @@
                 <w:szCs w:val="16"/>
                 <w:u w:val="none"/>
               </w:rPr>
-              <w:t>N = 3,496. All rules use the core algorithm's cut points (T &lt; 37 and T &lt; 48), so the rules differ in class prevalence as well as agreement. Function: 1 or more ADL or IADL limitations on the items in Table A9 (missing counted as none). Memory: memory worse than 2 years ago. Statistics are weighted (HCAP Wave 1 (2016) sampling weight); kappa, 3-class uses quadratic weights. Table A11 shows how these statistics vary across random halves of the sample.</w:t>
+              <w:t>N = 3,496. All rules use the core algorithm's cut points (T &lt; 39 and T &lt; 48), so the rules differ in class prevalence as well as agreement. Function: 1 or more ADL or IADL limitations on the items in Table A9 (missing counted as none). Memory: memory worse than 2 years ago. Statistics are weighted (HCAP Wave 1 (2016) sampling weight); kappa, 3-class uses quadratic weights. Table A11 shows how these statistics vary across random halves of the sample.</w:t>
             </w:r>
           </w:p>
         </w:tc>
@@ -18811,7 +18901,7 @@
                 <w:szCs w:val="16"/>
                 <w:u w:val="none"/>
               </w:rPr>
-              <w:t>0.35 (0.29, 0.41)</w:t>
+              <w:t>0.34 (0.27, 0.40)</w:t>
             </w:r>
           </w:p>
         </w:tc>
@@ -18988,7 +19078,7 @@
                 <w:szCs w:val="16"/>
                 <w:u w:val="none"/>
               </w:rPr>
-              <w:t>0.53 (0.49, 0.57)</w:t>
+              <w:t>0.53 (0.49, 0.56)</w:t>
             </w:r>
           </w:p>
         </w:tc>
@@ -19030,7 +19120,7 @@
                 <w:szCs w:val="16"/>
                 <w:u w:val="none"/>
               </w:rPr>
-              <w:t>+0.03 (0.00, +0.05)</w:t>
+              <w:t>+0.02 (+0.01, +0.04)</w:t>
             </w:r>
           </w:p>
         </w:tc>
@@ -19072,7 +19162,7 @@
                 <w:szCs w:val="16"/>
                 <w:u w:val="none"/>
               </w:rPr>
-              <w:t>99</w:t>
+              <w:t>98</w:t>
             </w:r>
           </w:p>
         </w:tc>
@@ -19114,7 +19204,7 @@
                 <w:szCs w:val="16"/>
                 <w:u w:val="none"/>
               </w:rPr>
-              <w:t>0.40 (0.34, 0.46)</w:t>
+              <w:t>0.39 (0.33, 0.44)</w:t>
             </w:r>
           </w:p>
         </w:tc>
@@ -19156,7 +19246,7 @@
                 <w:szCs w:val="16"/>
                 <w:u w:val="none"/>
               </w:rPr>
-              <w:t>+0.05 (-0.01, +0.11)</w:t>
+              <w:t>+0.05 (0.00, +0.11)</w:t>
             </w:r>
           </w:p>
         </w:tc>
@@ -19198,7 +19288,7 @@
                 <w:szCs w:val="16"/>
                 <w:u w:val="none"/>
               </w:rPr>
-              <w:t>94</w:t>
+              <w:t>97</w:t>
             </w:r>
           </w:p>
         </w:tc>
@@ -19291,7 +19381,7 @@
                 <w:szCs w:val="16"/>
                 <w:u w:val="none"/>
               </w:rPr>
-              <w:t>0.53 (0.49, 0.57)</w:t>
+              <w:t>0.52 (0.48, 0.56)</w:t>
             </w:r>
           </w:p>
         </w:tc>
@@ -19335,7 +19425,7 @@
                 <w:szCs w:val="16"/>
                 <w:u w:val="none"/>
               </w:rPr>
-              <w:t>+0.02 (+0.01, +0.04)</w:t>
+              <w:t>+0.02 (0.00, +0.03)</w:t>
             </w:r>
           </w:p>
         </w:tc>
@@ -19423,7 +19513,7 @@
                 <w:szCs w:val="16"/>
                 <w:u w:val="none"/>
               </w:rPr>
-              <w:t>0.41 (0.35, 0.46)</w:t>
+              <w:t>0.38 (0.33, 0.44)</w:t>
             </w:r>
           </w:p>
         </w:tc>
@@ -19467,7 +19557,7 @@
                 <w:szCs w:val="16"/>
                 <w:u w:val="none"/>
               </w:rPr>
-              <w:t>+0.05 (+0.02, +0.10)</w:t>
+              <w:t>+0.05 (+0.01, +0.08)</w:t>
             </w:r>
           </w:p>
         </w:tc>
@@ -19511,7 +19601,7 @@
                 <w:szCs w:val="16"/>
                 <w:u w:val="none"/>
               </w:rPr>
-              <w:t>100</w:t>
+              <w:t>99</w:t>
             </w:r>
           </w:p>
         </w:tc>
@@ -19561,7 +19651,7 @@
                 <w:szCs w:val="16"/>
                 <w:u w:val="none"/>
               </w:rPr>
-              <w:t>200 random halves of the sample, drawn within Manly-Jones class. In each half, agreement was computed for each rule at the core algorithm's cut points (T &lt; 37 and T &lt; 48). Entries are the mean across halves (2.5th and 97.5th percentiles). Differences are paired within half. The halves overlap, so the percentiles describe variation across halves and are not confidence intervals. Statistics are weighted (HCAP Wave 1 (2016) sampling weight); kappa, 3-class uses quadratic weights.</w:t>
+              <w:t>200 random halves of the sample, drawn within Manly-Jones class. In each half, agreement was computed for each rule at the core algorithm's cut points (T &lt; 39 and T &lt; 48). Entries are the mean across halves (2.5th and 97.5th percentiles). Differences are paired within half. The halves overlap, so the percentiles describe variation across halves and are not confidence intervals. Statistics are weighted (HCAP Wave 1 (2016) sampling weight); kappa, 3-class uses quadratic weights.</w:t>
             </w:r>
           </w:p>
         </w:tc>
@@ -20476,7 +20566,7 @@
       <mc:AlternateContent>
         <mc:Choice Requires="wps">
           <w:drawing>
-            <wp:anchor distT="0" distB="0" distL="0" distR="0" simplePos="0" relativeHeight="22" behindDoc="0" locked="0" layoutInCell="0" allowOverlap="1">
+            <wp:anchor distT="0" distB="0" distL="0" distR="0" simplePos="0" relativeHeight="23" behindDoc="0" locked="0" layoutInCell="0" allowOverlap="1">
               <wp:simplePos x="0" y="0"/>
               <wp:positionH relativeFrom="margin">
                 <wp:align>right</wp:align>
@@ -20545,7 +20635,7 @@
                                 <w:rPr>
                                   <w:rStyle w:val="PageNumber"/>
                                 </w:rPr>
-                                <w:t>18</w:t>
+                                <w:t>19</w:t>
                               </w:r>
                               <w:r>
                                 <w:rPr>
@@ -20612,7 +20702,7 @@
                           <w:rPr>
                             <w:rStyle w:val="PageNumber"/>
                           </w:rPr>
-                          <w:t>18</w:t>
+                          <w:t>19</w:t>
                         </w:r>
                         <w:r>
                           <w:rPr>
@@ -20667,7 +20757,7 @@
       <mc:AlternateContent>
         <mc:Choice Requires="wps">
           <w:drawing>
-            <wp:anchor distT="0" distB="0" distL="0" distR="0" simplePos="0" relativeHeight="22" behindDoc="0" locked="0" layoutInCell="0" allowOverlap="1">
+            <wp:anchor distT="0" distB="0" distL="0" distR="0" simplePos="0" relativeHeight="23" behindDoc="0" locked="0" layoutInCell="0" allowOverlap="1">
               <wp:simplePos x="0" y="0"/>
               <wp:positionH relativeFrom="margin">
                 <wp:align>right</wp:align>
@@ -20736,7 +20826,7 @@
                                 <w:rPr>
                                   <w:rStyle w:val="PageNumber"/>
                                 </w:rPr>
-                                <w:t>18</w:t>
+                                <w:t>19</w:t>
                               </w:r>
                               <w:r>
                                 <w:rPr>
@@ -20803,7 +20893,7 @@
                           <w:rPr>
                             <w:rStyle w:val="PageNumber"/>
                           </w:rPr>
-                          <w:t>18</w:t>
+                          <w:t>19</w:t>
                         </w:r>
                         <w:r>
                           <w:rPr>

</xml_diff>